<commit_message>
Fix workflow consistency and contribution phases
</commit_message>
<xml_diff>
--- a/templates/EB1A/EB1A_unified_template_LLM.docx
+++ b/templates/EB1A/EB1A_unified_template_LLM.docx
@@ -59,7 +59,7 @@
         <w:ind w:left="360"/>
       </w:pPr>
       <w:r>
-        <w:t>2) an LLM agent that must generate a consistent petition without inventing facts, scattering exhibits randomly, or producing a 300-page swamp with decorative citations. Humanity’s gift to bureaucracy continues.</w:t>
+        <w:t>2) an LLM agent that must generate a consistent petition without inventing facts, scattering exhibits randomly, or producing an unnecessarily long petition with unfocused citations.</w:t>
       </w:r>
     </w:p>
     <w:p>
@@ -385,7 +385,7 @@
     <w:p>
       <w:pPr/>
       <w:r>
-        <w:t>Use one format for the whole petition. Do not oscillate between “please kindly refer,” “see,” and “according to,” unless the goal is to make the officer wonder whether the petition was assembled by six raccoons.</w:t>
+        <w:t>Use one format for the whole petition. Do not oscillate between “please kindly refer,” “see,” and “according to.”</w:t>
       </w:r>
     </w:p>
     <w:p>
@@ -916,7 +916,7 @@
     <w:p>
       <w:pPr/>
       <w:r>
-        <w:t>This makes the file easier to review. Apparently officers prefer not needing a treasure map.</w:t>
+        <w:t>This makes the file easier to review and reduces citation errors.</w:t>
       </w:r>
     </w:p>
     <w:p>
@@ -1294,7 +1294,7 @@
     <w:p>
       <w:pPr/>
       <w:r>
-        <w:t>Use real page numbers only after final PDF assembly. Until then use __PAGE__ placeholders. Do not “estimate” page numbers unless you enjoy manufacturing future defects.</w:t>
+        <w:t>Use real page numbers only after final PDF assembly. Until then use __PAGE__ placeholders. Do not estimate page numbers; premature pagination creates avoidable errors.</w:t>
       </w:r>
     </w:p>
     <w:p>

</xml_diff>